<commit_message>
Planning doc v27: describe the Why? button on generated sub-goals; refresh plan-diff brief
Co-Authored-By: Claude Sonnet 5.5 <noreply@anthropic.com>
Claude-Session: https://claude.ai/code/session_01TbFnbS7mJo74CJLgFUKRLV
</commit_message>
<xml_diff>
--- a/Claude outputs/Telot Thesis Planning Documents v27.docx
+++ b/Claude outputs/Telot Thesis Planning Documents v27.docx
@@ -2117,7 +2117,7 @@
           <w:rFonts w:eastAsia="Aptos" w:cs="Aptos"/>
           <w:szCs w:val="24"/>
         </w:rPr>
-        <w:t xml:space="preserve">On the first screen (Fig 1), the searcher enters a search goal, what they already know, and what they want to find out. Jamie enters the assigned topic, “How green spaces affect wellbeing”, what the course module covered, “general physical and mental health benefits of nature exposure”, and what remains unclear, “whether policy interventions make a measurable difference”. From these three inputs, an LLM generates a list of candidate search directions, referred to in this thesis as sub-goals. The LLM proposes about eight candidates, roughly half of them angles the searcher has not mentioned, so the list is not limited to what the searcher already knows. Jamie’s list, shortened here for illustration, contains six candidates: physical health benefits, community access, Indigenous placemaking, mental health benefits, policy interventions, and urban planning tradeoffs. Jamie decides which of these to work with, can add sub-goals of their own with Add search direction, and can drag any sub-goal to a new place in the list to set the order. The numbered order of the selected sub-goals is kept and used later to rank sub-goals when a saved result matches several of them equally (see Organization: Saving into Sub-Goals). Pressing Explore saves the three texts and the selected sub-goals, in that order, and opens the results page on the first of them; candidates Jamie did not select are not kept. A saved plan can be reopened and changed, and pressing Explore again replaces it.</w:t>
+        <w:t xml:space="preserve">On the first screen (Fig 1), the searcher enters a search goal, what they already know, and what they want to find out. Jamie enters the assigned topic, “How green spaces affect wellbeing”, what the course module covered, “general physical and mental health benefits of nature exposure”, and what remains unclear, “whether policy interventions make a measurable difference”. From these three inputs, an LLM generates a list of candidate search directions, referred to in this thesis as sub-goals. The LLM proposes about eight candidates, roughly half of them angles the searcher has not mentioned, so the list reaches beyond what the searcher already knows. Jamie’s list, shortened here for illustration, contains six candidates: physical health benefits, community access, Indigenous placemaking, mental health benefits, policy interventions, and urban planning tradeoffs. Jamie decides which of these to work with, can add sub-goals of their own with Add search direction, and can drag any sub-goal to a new place in the list to set the order. The numbered order of the selected sub-goals is kept and used later to rank sub-goals when a saved result matches several of them equally (see Organization: Saving into Sub-Goals). Pressing Explore saves the three texts and the selected sub-goals, in that order, and opens the results page on the first of them; candidates Jamie did not select are not kept. A saved plan can be reopened and changed, and pressing Explore again replaces it.</w:t>
       </w:r>
       <w:r>
         <w:rPr>
@@ -2220,7 +2220,7 @@
           <w:rFonts w:eastAsia="Aptos" w:cs="Aptos"/>
           <w:color w:val="auto"/>
         </w:rPr>
-        <w:t xml:space="preserve">The LLM proposes the candidates, and the searcher decides which to work with, because GenAI scaffolding has been argued to support task management and metacognition when it offers prompts and awareness instead of automating the user’s process (Zhu et al. 2026). The list externalizes the goal-setting and strategy-identification that Crescenzi et al. treat as part of planning (Crescenzi et al. 2021), so Jamie does not need to hold the goal structure in mind, and the sub-goals stay on screen as the reference for the rest of the workspace, in the directions panel of the results page. Structured support for setting sub-goals with ideal characteristics has been associated with better knowledge retention than no support in a search-as-learning study (Urgo and Arguello 2024), which is why sub-goal generation is the step where the design uses its most capable model (see Implementation Note). </w:t>
+        <w:t xml:space="preserve">The LLM proposes the candidates, and the searcher decides which to work with, because GenAI scaffolding has been argued to support task management and metacognition when it offers prompts and awareness instead of automating the user’s process (Zhu et al. 2026). The list externalizes the goal-setting and strategy-identification that Crescenzi et al. treat as part of planning (Crescenzi et al. 2021), so Jamie does not need to hold the goal structure in mind, and the sub-goals stay on screen as the reference for the rest of the workspace, in the directions panel of the results page. Structured support for setting sub-goals with ideal characteristics has been associated with better knowledge retention than no support in a search-as-learning study (Urgo and Arguello 2024), which is why sub-goal generation is the step where the design uses its most capable model (see Implementation Note). Each candidate that the LLM proposes is marked with a sparkle icon and has a “Why?” button. Selecting the button shows one sentence under the candidate that says why searching in that direction helps with the search goal, and selecting it again hides the sentence. For Jamie’s community access, the sentence could read “Searching this helps you discover whether diverse communities benefit equally from urban green spaces.” The LLM writes this reason in the same step that proposes the candidate, so showing it needs no further call. A sub-goal that Jamie adds has no sparkle and no reason, because Jamie wrote it. The reason is kept with each sub-goal that Jamie selects and appears again when Jamie reopens the plan. The reason gives Jamie something to weigh a candidate by, including a candidate Jamie had not thought of, and it follows the guidance to make clear why the system did what it did (Amershi et al. 2019) and to show the user why a particular output was generated (Weisz et al. 2024). The button only shows the reason, and Jamie still ticks a candidate to select it. </w:t>
       </w:r>
     </w:p>
     <w:p>
@@ -3375,7 +3375,7 @@
           <w:rFonts w:eastAsia="Aptos" w:cs="Aptos"/>
           <w:szCs w:val="24"/>
         </w:rPr>
-        <w:t xml:space="preserve">This division shows at each step. In planning, the LLM offers candidate sub-goals, and Jamie chooses which to work with and can add others. Jamie can change any generated query and search with their own wording, which fits the strategy of offering ways to improve outputs by editing them (Weisz et al. 2024). On the results page, the stars and sub-goal tags are cues for judging a result, and Jamie decides whether to open it, read it, and save it, and under which sub-goal. Facets suggested by the system appear in the “What you might explore” panel, and Jamie adds or dismisses each one, so none joins the plan unless Jamie adds it. This follows the guideline to make it easy to dismiss or ignore undesired AI system services (Amershi et al. 2019). The system does not read the results for Jamie, does not write summaries of them, and does not choose the next step. Continue Last Activity is a shortcut that Jamie can ignore.</w:t>
+        <w:t xml:space="preserve">This division shows at each step. In planning, the LLM offers candidate sub-goals, each with a “Why?” button that shows the reason it was proposed, and Jamie chooses which to work with and can add others. Jamie can change any generated query and search with their own wording, which fits the strategy of offering ways to improve outputs by editing them (Weisz et al. 2024). On the results page, the stars and sub-goal tags are cues for judging a result, and Jamie decides whether to open it, read it, and save it, and under which sub-goal. Facets suggested by the system appear in the “What you might explore” panel, and Jamie adds or dismisses each one, so none joins the plan unless Jamie adds it. This follows the guideline to make it easy to dismiss or ignore undesired AI system services (Amershi et al. 2019). The system does not read the results for Jamie, does not write summaries of them, and does not choose the next step. Continue Last Activity is a shortcut that Jamie can ignore.</w:t>
       </w:r>
     </w:p>
     <w:p>

</xml_diff>